<commit_message>
new feature: - FE02_Resident_Management: Done - FE03_Apartment_Unit_Management: Done fix bug and update: - FE01_Authen
</commit_message>
<xml_diff>
--- a/docs/requirements/PropFlow_Actor_Responsibility_Feature_FE-01_Detail.docx
+++ b/docs/requirements/PropFlow_Actor_Responsibility_Feature_FE-01_Detail.docx
@@ -5927,7 +5927,7 @@
     </w:tbl>
     <w:p>
       <w:r>
-        <w:t>Possible verification mechanisms can be chosen during detailed design. The Report 1 feature should avoid locking the implementation prematurely. Examples include:</w:t>
+        <w:t>Current implementation fixes the verification mechanism: all four normalized values below must match the same existing Resident before an OTP can be issued.</w:t>
       </w:r>
     </w:p>
     <w:p>
@@ -5936,7 +5936,7 @@
         <w:spacing w:after="60"/>
       </w:pPr>
       <w:r>
-        <w:t>Invitation/activation code provided by apartment management.</w:t>
+        <w:t>Email: trim and lowercase.</w:t>
       </w:r>
     </w:p>
     <w:p>
@@ -5945,7 +5945,7 @@
         <w:spacing w:after="60"/>
       </w:pPr>
       <w:r>
-        <w:t>Invitation link generated for a Resident record.</w:t>
+        <w:t>Phone number: required and matched in the canonical FE-02 representation, but not globally unique and never used alone.</w:t>
       </w:r>
     </w:p>
     <w:p>
@@ -5954,7 +5954,7 @@
         <w:spacing w:after="60"/>
       </w:pPr>
       <w:r>
-        <w:t>Matching a pre-registered email or phone number.</w:t>
+        <w:t>Identity type: CCCD or CMND.</w:t>
       </w:r>
     </w:p>
     <w:p>
@@ -5963,7 +5963,7 @@
         <w:spacing w:after="60"/>
       </w:pPr>
       <w:r>
-        <w:t>Manager/Admin approval of a pending Resident account.</w:t>
+        <w:t>Identity number: digits-only; CCCD has 12 digits, CMND has 9 or 12 digits.</w:t>
       </w:r>
     </w:p>
     <w:p>
@@ -5972,7 +5972,7 @@
         <w:spacing w:after="60"/>
       </w:pPr>
       <w:r>
-        <w:t>A controlled combination of identity data already stored in the Resident record.</w:t>
+        <w:t>The matching Resident must be ACTIVE, have no linked UserId, and have an active residency or current ownership. Historical-only relationships do not qualify.</w:t>
       </w:r>
     </w:p>
     <w:p>
@@ -9595,6 +9595,54 @@
     <w:p>
       <w:r>
         <w:t>FE-01 is considered stable enough to serve as the authentication/account baseline. The next feature to decompose should be FE-02 - Resident Management, especially the Resident profile lifecycle and the Resident ↔ User Account ↔ Apartment relationships. FE-02 to FE-15 should not be considered fully specified until each is reviewed at the same level of detail as FE-01.</w:t>
+      </w:r>
+    </w:p>
+    <w:p>
+      <w:pPr>
+        <w:pStyle w:val="Heading1"/>
+      </w:pPr>
+      <w:r>
+        <w:rPr>
+          <w:color w:val="000000"/>
+        </w:rPr>
+        <w:t>10 Current Registration Contract</w:t>
+      </w:r>
+    </w:p>
+    <w:p>
+      <w:r>
+        <w:t>Resident self-registration is not email-only. The public request requires email, phone number, identity type and identity number, and all four normalized values must match the same Resident. OWNER_ONLY, RESIDENT_ONLY and OWNER_AND_RESIDENT are eligible when the Resident has the corresponding current qualifying relationship.</w:t>
+      </w:r>
+    </w:p>
+    <w:p>
+      <w:pPr>
+        <w:pStyle w:val="ListBullet"/>
+      </w:pPr>
+      <w:r>
+        <w:t>The public mismatch response is generic and does not reveal which field failed, whether a Resident exists, whether an account is already linked, or whether the Resident is inactive.</w:t>
+      </w:r>
+    </w:p>
+    <w:p>
+      <w:pPr>
+        <w:pStyle w:val="ListBullet"/>
+      </w:pPr>
+      <w:r>
+        <w:t>OTP is created only after exact matching and eligibility. The challenge is bound to the Resident fingerprint.</w:t>
+      </w:r>
+    </w:p>
+    <w:p>
+      <w:pPr>
+        <w:pStyle w:val="ListBullet"/>
+      </w:pPr>
+      <w:r>
+        <w:t>Before activation, the system revalidates Resident existence, ACTIVE status, unlinked state, qualifying current relationship and the registration fingerprint.</w:t>
+      </w:r>
+    </w:p>
+    <w:p>
+      <w:pPr>
+        <w:pStyle w:val="ListBullet"/>
+      </w:pPr>
+      <w:r>
+        <w:t>Authentication owns account and registration. FE-02 owns Resident and residency. FE-03 owns Apartment and ownership. Authentication uses Residents public Contracts only and does not access ResidentsDbContext or ApartmentsDbContext.</w:t>
       </w:r>
     </w:p>
     <w:sectPr>

</xml_diff>